<commit_message>
Resume: Cybersecurity Engineer @ PayPal (MNC)
</commit_message>
<xml_diff>
--- a/resumes/Resume_Cybersecurity_Engineer_PayPal__MNC_.docx
+++ b/resumes/Resume_Cybersecurity_Engineer_PayPal__MNC_.docx
@@ -4,7 +4,7 @@
   <w:body>
     <w:p>
       <w:pPr>
-        <w:spacing w:after="44"/>
+        <w:spacing w:after="0" w:before="20"/>
         <w:jc w:val="center"/>
       </w:pPr>
       <w:r>
@@ -21,6 +21,7 @@
     </w:p>
     <w:p>
       <w:pPr>
+        <w:spacing w:before="20" w:after="0"/>
         <w:jc w:val="center"/>
       </w:pPr>
       <w:r>
@@ -116,7 +117,7 @@
         <w:pBdr>
           <w:bottom w:val="single" w:sz="6" w:space="1" w:color="000000"/>
         </w:pBdr>
-        <w:spacing w:before="360" w:after="52"/>
+        <w:spacing w:before="158" w:after="0"/>
       </w:pPr>
       <w:r>
         <w:rPr>
@@ -135,7 +136,7 @@
         <w:tabs>
           <w:tab w:val="right" w:pos="10800"/>
         </w:tabs>
-        <w:spacing w:before="62"/>
+        <w:spacing w:before="20" w:after="0"/>
       </w:pPr>
       <w:r>
         <w:rPr>
@@ -168,7 +169,7 @@
     </w:p>
     <w:p>
       <w:pPr>
-        <w:spacing w:before="8"/>
+        <w:spacing w:before="8" w:after="0"/>
       </w:pPr>
       <w:r>
         <w:rPr>
@@ -187,7 +188,7 @@
         <w:tabs>
           <w:tab w:val="right" w:pos="10800"/>
         </w:tabs>
-        <w:spacing w:before="62"/>
+        <w:spacing w:before="20" w:after="0"/>
       </w:pPr>
       <w:r>
         <w:rPr>
@@ -220,7 +221,7 @@
     </w:p>
     <w:p>
       <w:pPr>
-        <w:spacing w:before="8"/>
+        <w:spacing w:before="8" w:after="0"/>
       </w:pPr>
       <w:r>
         <w:rPr>
@@ -239,7 +240,7 @@
         <w:tabs>
           <w:tab w:val="right" w:pos="10800"/>
         </w:tabs>
-        <w:spacing w:before="62"/>
+        <w:spacing w:before="20" w:after="0"/>
       </w:pPr>
       <w:r>
         <w:rPr>
@@ -272,7 +273,7 @@
     </w:p>
     <w:p>
       <w:pPr>
-        <w:spacing w:before="8"/>
+        <w:spacing w:before="8" w:after="0"/>
       </w:pPr>
       <w:r>
         <w:rPr>
@@ -288,7 +289,7 @@
     </w:p>
     <w:p>
       <w:pPr>
-        <w:spacing w:before="8"/>
+        <w:spacing w:before="35" w:after="35"/>
       </w:pPr>
     </w:p>
     <w:p>
@@ -296,7 +297,7 @@
         <w:pBdr>
           <w:bottom w:val="single" w:sz="6" w:space="1" w:color="000000"/>
         </w:pBdr>
-        <w:spacing w:before="155" w:after="52"/>
+        <w:spacing w:before="158" w:after="0"/>
       </w:pPr>
       <w:r>
         <w:rPr>
@@ -315,7 +316,7 @@
         <w:tabs>
           <w:tab w:val="right" w:pos="10800"/>
         </w:tabs>
-        <w:spacing w:before="62"/>
+        <w:spacing w:before="20" w:after="0"/>
       </w:pPr>
       <w:r>
         <w:rPr>
@@ -359,7 +360,7 @@
         <w:tabs>
           <w:tab w:val="right" w:pos="10800"/>
         </w:tabs>
-        <w:spacing w:before="8"/>
+        <w:spacing w:before="8" w:after="0"/>
       </w:pPr>
       <w:r>
         <w:rPr>
@@ -403,16 +404,16 @@
           <w:ilvl w:val="0"/>
           <w:numId w:val="2"/>
         </w:numPr>
-        <w:spacing w:before="13" w:after="13"/>
-      </w:pPr>
-      <w:r>
-        <w:rPr>
-          <w:rFonts w:ascii="Source Sans Pro" w:eastAsia="Source Sans Pro" w:hAnsi="Source Sans Pro" w:cs="Source Sans Pro"/>
-          <w:color w:val="000000"/>
-          <w:sz w:val="19"/>
-          <w:szCs w:val="19"/>
-        </w:rPr>
-        <w:t>Triaged 50+ weekly inventory reimbursement cases by severity and policy eligibility, mirroring SOC Tier 1 analyst workflow.</w:t>
+        <w:spacing w:before="13" w:after="44"/>
+      </w:pPr>
+      <w:r>
+        <w:rPr>
+          <w:rFonts w:ascii="Source Sans Pro" w:eastAsia="Source Sans Pro" w:hAnsi="Source Sans Pro" w:cs="Source Sans Pro"/>
+          <w:color w:val="000000"/>
+          <w:sz w:val="19"/>
+          <w:szCs w:val="19"/>
+        </w:rPr>
+        <w:t>Triaged 50+ weekly inventory reimbursement cases by severity and policy eligibility, mirroring the structured alert triage and escalation workflow used in SOC Tier 1 analyst roles.</w:t>
       </w:r>
       <w:proofErr w:type="spellStart"/>
       <w:r>
@@ -440,16 +441,16 @@
           <w:ilvl w:val="0"/>
           <w:numId w:val="2"/>
         </w:numPr>
-        <w:spacing w:before="13" w:after="13"/>
-      </w:pPr>
-      <w:r>
-        <w:rPr>
-          <w:rFonts w:ascii="Source Sans Pro" w:eastAsia="Source Sans Pro" w:hAnsi="Source Sans Pro" w:cs="Source Sans Pro"/>
-          <w:color w:val="000000"/>
-          <w:sz w:val="19"/>
-          <w:szCs w:val="19"/>
-        </w:rPr>
-        <w:t>Conducted root cause analysis on seller claims to identify policy violations and anomalous patterns; escalated findings to senior reviewers.</w:t>
+        <w:spacing w:before="13" w:after="44"/>
+      </w:pPr>
+      <w:r>
+        <w:rPr>
+          <w:rFonts w:ascii="Source Sans Pro" w:eastAsia="Source Sans Pro" w:hAnsi="Source Sans Pro" w:cs="Source Sans Pro"/>
+          <w:color w:val="000000"/>
+          <w:sz w:val="19"/>
+          <w:szCs w:val="19"/>
+        </w:rPr>
+        <w:t>Conducted root cause analysis on seller claims, identifying policy violations and anomalous patterns, and escalated findings to senior reviewers.</w:t>
       </w:r>
     </w:p>
     <w:p>
@@ -459,35 +460,16 @@
           <w:ilvl w:val="0"/>
           <w:numId w:val="2"/>
         </w:numPr>
-        <w:spacing w:before="13" w:after="13"/>
-      </w:pPr>
-      <w:r>
-        <w:rPr>
-          <w:rFonts w:ascii="Source Sans Pro" w:eastAsia="Source Sans Pro" w:hAnsi="Source Sans Pro" w:cs="Source Sans Pro"/>
-          <w:color w:val="000000"/>
-          <w:sz w:val="19"/>
-          <w:szCs w:val="19"/>
-        </w:rPr>
-        <w:t>Maintained audit-ready case documentation recording investigation findings, decisions, and corrective actions, establishing security incident reporting discipline.</w:t>
-      </w:r>
-    </w:p>
-    <w:p>
-      <w:pPr>
-        <w:pStyle w:val="ListParagraph"/>
-        <w:numPr>
-          <w:ilvl w:val="0"/>
-          <w:numId w:val="2"/>
-        </w:numPr>
-        <w:spacing w:before="13" w:after="13"/>
-      </w:pPr>
-      <w:r>
-        <w:rPr>
-          <w:rFonts w:ascii="Source Sans Pro" w:eastAsia="Source Sans Pro" w:hAnsi="Source Sans Pro" w:cs="Source Sans Pro"/>
-          <w:color w:val="000000"/>
-          <w:sz w:val="19"/>
-          <w:szCs w:val="19"/>
-        </w:rPr>
-        <w:t>[[AMZ_B4]]</w:t>
+        <w:spacing w:before="13" w:after="44"/>
+      </w:pPr>
+      <w:r>
+        <w:rPr>
+          <w:rFonts w:ascii="Source Sans Pro" w:eastAsia="Source Sans Pro" w:hAnsi="Source Sans Pro" w:cs="Source Sans Pro"/>
+          <w:color w:val="000000"/>
+          <w:sz w:val="19"/>
+          <w:szCs w:val="19"/>
+        </w:rPr>
+        <w:t>Maintained audit-ready case documentation, recording investigation findings, decisions, and corrective actions to support security incident reporting and IT audit.</w:t>
       </w:r>
     </w:p>
     <w:p>
@@ -495,7 +477,7 @@
         <w:pBdr>
           <w:bottom w:val="single" w:sz="6" w:space="1" w:color="000000"/>
         </w:pBdr>
-        <w:spacing w:before="155" w:after="52"/>
+        <w:spacing w:before="35" w:after="35"/>
         <w:rPr>
           <w:rFonts w:ascii="Source Sans Pro" w:eastAsia="Source Sans Pro" w:hAnsi="Source Sans Pro" w:cs="Source Sans Pro"/>
           <w:b/>
@@ -511,7 +493,7 @@
         <w:pBdr>
           <w:bottom w:val="single" w:sz="6" w:space="1" w:color="000000"/>
         </w:pBdr>
-        <w:spacing w:before="155" w:after="52"/>
+        <w:spacing w:before="158" w:after="0"/>
       </w:pPr>
       <w:r>
         <w:rPr>
@@ -530,7 +512,7 @@
         <w:tabs>
           <w:tab w:val="right" w:pos="10800"/>
         </w:tabs>
-        <w:spacing w:before="62"/>
+        <w:spacing w:before="20" w:after="0"/>
       </w:pPr>
       <w:proofErr w:type="spellStart"/>
       <w:proofErr w:type="spellEnd"/>
@@ -544,7 +526,7 @@
             <w:color w:val="000000"/>
             <w:u w:val="single"/>
           </w:rPr>
-          <w:t>Vulnerability Scanner &amp; Patch Prioritization Engine</w:t>
+          <w:t>Cybersecurity Engineer at PayPal</w:t>
         </w:r>
       </w:hyperlink>
       <w:r>
@@ -572,16 +554,16 @@
           <w:ilvl w:val="0"/>
           <w:numId w:val="2"/>
         </w:numPr>
-        <w:spacing w:before="13" w:after="13"/>
-      </w:pPr>
-      <w:r>
-        <w:rPr>
-          <w:rFonts w:ascii="Source Sans Pro" w:eastAsia="Source Sans Pro" w:hAnsi="Source Sans Pro" w:cs="Source Sans Pro"/>
-          <w:color w:val="000000"/>
-          <w:sz w:val="19"/>
-          <w:szCs w:val="19"/>
-        </w:rPr>
-        <w:t>Built automated vulnerability assessment pipeline integrating Nessus and OpenVAS REST APIs in Python; generates CVE reports classified by CVSS severity.</w:t>
+        <w:spacing w:before="13" w:after="44"/>
+      </w:pPr>
+      <w:r>
+        <w:rPr>
+          <w:rFonts w:ascii="Source Sans Pro" w:eastAsia="Source Sans Pro" w:hAnsi="Source Sans Pro" w:cs="Source Sans Pro"/>
+          <w:color w:val="000000"/>
+          <w:sz w:val="19"/>
+          <w:szCs w:val="19"/>
+        </w:rPr>
+        <w:t>Developed automated vulnerability assessment pipeline in Python, integrating Nessus and OpenVAS APIs, and utilizing EPSS scoring from FIRST.org API for prioritization.</w:t>
       </w:r>
     </w:p>
     <w:p>
@@ -591,16 +573,16 @@
           <w:ilvl w:val="0"/>
           <w:numId w:val="2"/>
         </w:numPr>
-        <w:spacing w:before="13" w:after="13"/>
-      </w:pPr>
-      <w:r>
-        <w:rPr>
-          <w:rFonts w:ascii="Source Sans Pro" w:eastAsia="Source Sans Pro" w:hAnsi="Source Sans Pro" w:cs="Source Sans Pro"/>
-          <w:color w:val="000000"/>
-          <w:sz w:val="19"/>
-          <w:szCs w:val="19"/>
-        </w:rPr>
-        <w:t>Developed OWASP Top 10 automated web checker that sends crafted HTTP requests to detect injection, broken auth, and SSRF vulnerabilities.</w:t>
+        <w:spacing w:before="13" w:after="44"/>
+      </w:pPr>
+      <w:r>
+        <w:rPr>
+          <w:rFonts w:ascii="Source Sans Pro" w:eastAsia="Source Sans Pro" w:hAnsi="Source Sans Pro" w:cs="Source Sans Pro"/>
+          <w:color w:val="000000"/>
+          <w:sz w:val="19"/>
+          <w:szCs w:val="19"/>
+        </w:rPr>
+        <w:t>Developed OWASP Top 10 automated web checker to detect injection, auth, and SSRF vulnerabilities via crafted HTTP requests and documented SQL injection remediation.</w:t>
       </w:r>
     </w:p>
     <w:p>
@@ -610,16 +592,16 @@
           <w:ilvl w:val="0"/>
           <w:numId w:val="2"/>
         </w:numPr>
-        <w:spacing w:before="13" w:after="13"/>
-      </w:pPr>
-      <w:r>
-        <w:rPr>
-          <w:rFonts w:ascii="Source Sans Pro" w:eastAsia="Source Sans Pro" w:hAnsi="Source Sans Pro" w:cs="Source Sans Pro"/>
-          <w:color w:val="000000"/>
-          <w:sz w:val="19"/>
-          <w:szCs w:val="19"/>
-        </w:rPr>
-        <w:t>Automated scan scheduling via Bash and cron; built delta-scan logic to flag newly discovered CVEs and calculate remediation SLA deadlines.</w:t>
+        <w:spacing w:before="13" w:after="44"/>
+      </w:pPr>
+      <w:r>
+        <w:rPr>
+          <w:rFonts w:ascii="Source Sans Pro" w:eastAsia="Source Sans Pro" w:hAnsi="Source Sans Pro" w:cs="Source Sans Pro"/>
+          <w:color w:val="000000"/>
+          <w:sz w:val="19"/>
+          <w:szCs w:val="19"/>
+        </w:rPr>
+        <w:t>Automated scan scheduling via Bash and cron; built delta-scan logic to flag new CVEs and calculate remediation deadlines (Critical=24hrs, High=7 days, Medium=30 days).</w:t>
       </w:r>
       <w:proofErr w:type="spellStart"/>
       <w:r>
@@ -660,7 +642,7 @@
     </w:p>
     <w:p>
       <w:pPr>
-        <w:spacing w:before="30"/>
+        <w:spacing w:before="35" w:after="35"/>
       </w:pPr>
     </w:p>
     <w:p>
@@ -668,7 +650,7 @@
         <w:tabs>
           <w:tab w:val="right" w:pos="10800"/>
         </w:tabs>
-        <w:spacing w:before="30"/>
+        <w:spacing w:before="30" w:after="0"/>
       </w:pPr>
       <w:hyperlink r:id="rId14">
         <w:r>
@@ -680,7 +662,7 @@
             <w:color w:val="000000"/>
             <w:u w:val="single"/>
           </w:rPr>
-          <w:t>SOC Automation &amp; Threat Detection Lab</w:t>
+          <w:t>Cybersecurity Engineer at PayPal</w:t>
         </w:r>
       </w:hyperlink>
       <w:r>
@@ -708,16 +690,16 @@
           <w:ilvl w:val="0"/>
           <w:numId w:val="2"/>
         </w:numPr>
-        <w:spacing w:before="13" w:after="13"/>
-      </w:pPr>
-      <w:r>
-        <w:rPr>
-          <w:rFonts w:ascii="Source Sans Pro" w:eastAsia="Source Sans Pro" w:hAnsi="Source Sans Pro" w:cs="Source Sans Pro"/>
-          <w:color w:val="000000"/>
-          <w:sz w:val="19"/>
-          <w:szCs w:val="19"/>
-        </w:rPr>
-        <w:t>Deployed Splunk SIEM with SPL correlation searches for brute-force detection, lateral movement, and privilege escalation; mapped TTPs to MITRE ATT&amp;CK.</w:t>
+        <w:spacing w:before="13" w:after="44"/>
+      </w:pPr>
+      <w:r>
+        <w:rPr>
+          <w:rFonts w:ascii="Source Sans Pro" w:eastAsia="Source Sans Pro" w:hAnsi="Source Sans Pro" w:cs="Source Sans Pro"/>
+          <w:color w:val="000000"/>
+          <w:sz w:val="19"/>
+          <w:szCs w:val="19"/>
+        </w:rPr>
+        <w:t>Deployed Splunk SIEM with SPL searches for brute-force detection, lateral movement, and privilege escalation (T1110, T1078, T1059); mapped TTPs and wrote incident report.</w:t>
       </w:r>
     </w:p>
     <w:p>
@@ -727,16 +709,16 @@
           <w:ilvl w:val="0"/>
           <w:numId w:val="2"/>
         </w:numPr>
-        <w:spacing w:before="13" w:after="13"/>
-      </w:pPr>
-      <w:r>
-        <w:rPr>
-          <w:rFonts w:ascii="Source Sans Pro" w:eastAsia="Source Sans Pro" w:hAnsi="Source Sans Pro" w:cs="Source Sans Pro"/>
-          <w:color w:val="000000"/>
-          <w:sz w:val="19"/>
-          <w:szCs w:val="19"/>
-        </w:rPr>
-        <w:t>Built automated SOAR-style detection pipeline: Python script ingests Splunk alerts, runs IOC enrichment via VirusTotal API, and dispatches Telegram notifications.</w:t>
+        <w:spacing w:before="13" w:after="44"/>
+      </w:pPr>
+      <w:r>
+        <w:rPr>
+          <w:rFonts w:ascii="Source Sans Pro" w:eastAsia="Source Sans Pro" w:hAnsi="Source Sans Pro" w:cs="Source Sans Pro"/>
+          <w:color w:val="000000"/>
+          <w:sz w:val="19"/>
+          <w:szCs w:val="19"/>
+        </w:rPr>
+        <w:t>Built automated SOAR-style detection pipeline: ingests Splunk alerts, enriches with VirusTotal API, and dispatches Telegram notifications with severity classification.</w:t>
       </w:r>
     </w:p>
     <w:p>
@@ -746,16 +728,16 @@
           <w:ilvl w:val="0"/>
           <w:numId w:val="2"/>
         </w:numPr>
-        <w:spacing w:before="13" w:after="13"/>
-      </w:pPr>
-      <w:r>
-        <w:rPr>
-          <w:rFonts w:ascii="Source Sans Pro" w:eastAsia="Source Sans Pro" w:hAnsi="Source Sans Pro" w:cs="Source Sans Pro"/>
-          <w:color w:val="000000"/>
-          <w:sz w:val="19"/>
-          <w:szCs w:val="19"/>
-        </w:rPr>
-        <w:t>Converted detection logic to Sigma rules (vendor-neutral format used by enterprise SOCs); performed TCP/IP analysis in Wireshark to detect SYN scans and DNS tunnelling.</w:t>
+        <w:spacing w:before="13" w:after="44"/>
+      </w:pPr>
+      <w:r>
+        <w:rPr>
+          <w:rFonts w:ascii="Source Sans Pro" w:eastAsia="Source Sans Pro" w:hAnsi="Source Sans Pro" w:cs="Source Sans Pro"/>
+          <w:color w:val="000000"/>
+          <w:sz w:val="19"/>
+          <w:szCs w:val="19"/>
+        </w:rPr>
+        <w:t>Converted detection logic to Sigma rules; analyzed TCP/IP traffic in Wireshark for SYN scans, DNS tunnelling, and plaintext credential exposure.</w:t>
       </w:r>
     </w:p>
     <w:p>
@@ -763,7 +745,7 @@
         <w:pBdr>
           <w:bottom w:val="single" w:sz="6" w:space="1" w:color="000000"/>
         </w:pBdr>
-        <w:spacing w:before="155" w:after="52"/>
+        <w:spacing w:before="35" w:after="35"/>
         <w:rPr>
           <w:rFonts w:ascii="Source Sans Pro" w:eastAsia="Source Sans Pro" w:hAnsi="Source Sans Pro" w:cs="Source Sans Pro"/>
           <w:b/>
@@ -779,7 +761,7 @@
         <w:pBdr>
           <w:bottom w:val="single" w:sz="6" w:space="1" w:color="000000"/>
         </w:pBdr>
-        <w:spacing w:before="155" w:after="52"/>
+        <w:spacing w:before="158" w:after="0"/>
       </w:pPr>
       <w:r>
         <w:rPr>
@@ -795,7 +777,7 @@
     </w:p>
     <w:p>
       <w:pPr>
-        <w:spacing w:before="24" w:after="24"/>
+        <w:spacing w:before="59" w:after="59"/>
       </w:pPr>
       <w:r>
         <w:rPr>
@@ -817,7 +799,7 @@
     </w:p>
     <w:p>
       <w:pPr>
-        <w:spacing w:before="24" w:after="24"/>
+        <w:spacing w:before="59" w:after="59"/>
       </w:pPr>
       <w:r>
         <w:rPr>
@@ -839,7 +821,7 @@
     </w:p>
     <w:p>
       <w:pPr>
-        <w:spacing w:before="24" w:after="24"/>
+        <w:spacing w:before="59" w:after="59"/>
       </w:pPr>
       <w:r>
         <w:rPr>
@@ -861,7 +843,7 @@
     </w:p>
     <w:p>
       <w:pPr>
-        <w:spacing w:before="24" w:after="24"/>
+        <w:spacing w:before="59" w:after="59"/>
       </w:pPr>
       <w:r>
         <w:rPr>
@@ -883,7 +865,7 @@
     </w:p>
     <w:p>
       <w:pPr>
-        <w:spacing w:before="24" w:after="24"/>
+        <w:spacing w:before="59" w:after="59"/>
       </w:pPr>
       <w:r>
         <w:rPr>
@@ -900,7 +882,7 @@
           <w:sz w:val="19"/>
           <w:szCs w:val="19"/>
         </w:rPr>
-        <w:t>Python, Bash (basic), regular expressions</w:t>
+        <w:t>Python, Bash (basic), regular expressions, security, compliance, risk</w:t>
       </w:r>
     </w:p>
     <w:p>
@@ -908,7 +890,7 @@
         <w:pBdr>
           <w:bottom w:val="single" w:sz="6" w:space="1" w:color="000000"/>
         </w:pBdr>
-        <w:spacing w:before="155" w:after="52"/>
+        <w:spacing w:before="35" w:after="35"/>
         <w:rPr>
           <w:rFonts w:ascii="Source Sans Pro" w:eastAsia="Source Sans Pro" w:hAnsi="Source Sans Pro" w:cs="Source Sans Pro"/>
           <w:b/>
@@ -924,7 +906,7 @@
         <w:pBdr>
           <w:bottom w:val="single" w:sz="6" w:space="1" w:color="000000"/>
         </w:pBdr>
-        <w:spacing w:before="155" w:after="52"/>
+        <w:spacing w:before="158" w:after="0"/>
       </w:pPr>
       <w:r>
         <w:rPr>
@@ -945,7 +927,7 @@
           <w:ilvl w:val="0"/>
           <w:numId w:val="2"/>
         </w:numPr>
-        <w:spacing w:before="13" w:after="13"/>
+        <w:spacing w:before="13" w:after="44"/>
       </w:pPr>
       <w:r>
         <w:rPr>
@@ -964,7 +946,7 @@
           <w:ilvl w:val="0"/>
           <w:numId w:val="2"/>
         </w:numPr>
-        <w:spacing w:before="13" w:after="13"/>
+        <w:spacing w:before="13" w:after="44"/>
       </w:pPr>
       <w:r>
         <w:rPr>

</xml_diff>